<commit_message>
Novo fluxo de Atas: campos do Secretário, validação pelos irmãos, ordem de assinaturas, envio por e-mail, assinaturas visuais e preview
- Formulário na sessão com os campos livres do modelo (pauta, levantamentos, ausências, encerramento) antes de gerar o rascunho
- Fluxo: rascunho → envio aos irmãos para validação (EM_VALIDACAO) → campo de ajustes → liberar para assinaturas → VM assina primeiro, depois o Secretário → envio final aos irmãos (bcc); ata não vai mais à Guarda dos Selos
- Imagem de assinatura no cadastro (VM/Secretário/Orador) exibida no preview do documento
- Preview da ata em formato de documento com bloco de assinaturas
- Migrações: sentToMembersAt, signatureUrl, EM_VALIDACAO/ajustes/sentForReviewAt

Co-Authored-By: Claude Fable 5 <noreply@anthropic.com>
Claude-Session: https://claude.ai/code/session_01RJqoUGHSccvxFN3iE9HGH8
</commit_message>
<xml_diff>
--- a/Ata modelo.docx
+++ b/Ata modelo.docx
@@ -172,6 +172,16 @@
       <w:r>
         <w:rPr>
           <w:rFonts w:ascii="Times New Roman" w:eastAsia="Arial" w:hAnsi="Times New Roman" w:cs="Times New Roman"/>
+          <w:color w:val="000000"/>
+          <w:sz w:val="24"/>
+          <w:szCs w:val="24"/>
+          <w:lang w:val="en-US"/>
+        </w:rPr>
+        <w:t>[</w:t>
+      </w:r>
+      <w:r>
+        <w:rPr>
+          <w:rFonts w:ascii="Times New Roman" w:eastAsia="Arial" w:hAnsi="Times New Roman" w:cs="Times New Roman"/>
           <w:sz w:val="24"/>
           <w:szCs w:val="24"/>
         </w:rPr>
@@ -180,6 +190,14 @@
       <w:r>
         <w:rPr>
           <w:rFonts w:ascii="Times New Roman" w:eastAsia="Arial" w:hAnsi="Times New Roman" w:cs="Times New Roman"/>
+          <w:sz w:val="24"/>
+          <w:szCs w:val="24"/>
+        </w:rPr>
+        <w:t>]</w:t>
+      </w:r>
+      <w:r>
+        <w:rPr>
+          <w:rFonts w:ascii="Times New Roman" w:eastAsia="Arial" w:hAnsi="Times New Roman" w:cs="Times New Roman"/>
           <w:color w:val="000000"/>
           <w:sz w:val="24"/>
           <w:szCs w:val="24"/>
@@ -201,8 +219,17 @@
           <w:color w:val="000000"/>
           <w:sz w:val="24"/>
           <w:szCs w:val="24"/>
-        </w:rPr>
-        <w:t>XXX</w:t>
+          <w:lang w:val="en-US"/>
+        </w:rPr>
+        <w:t>[</w:t>
+      </w:r>
+      <w:r>
+        <w:rPr>
+          <w:rFonts w:ascii="Times New Roman" w:eastAsia="Arial" w:hAnsi="Times New Roman" w:cs="Times New Roman"/>
+          <w:sz w:val="24"/>
+          <w:szCs w:val="24"/>
+        </w:rPr>
+        <w:t>XX]</w:t>
       </w:r>
       <w:r>
         <w:rPr>
@@ -252,7 +279,25 @@
           <w:sz w:val="24"/>
           <w:szCs w:val="24"/>
         </w:rPr>
-        <w:t>e XXX</w:t>
+        <w:t xml:space="preserve">e </w:t>
+      </w:r>
+      <w:r>
+        <w:rPr>
+          <w:rFonts w:ascii="Times New Roman" w:eastAsia="Arial" w:hAnsi="Times New Roman" w:cs="Times New Roman"/>
+          <w:color w:val="000000"/>
+          <w:sz w:val="24"/>
+          <w:szCs w:val="24"/>
+          <w:lang w:val="en-US"/>
+        </w:rPr>
+        <w:t>[</w:t>
+      </w:r>
+      <w:r>
+        <w:rPr>
+          <w:rFonts w:ascii="Times New Roman" w:eastAsia="Arial" w:hAnsi="Times New Roman" w:cs="Times New Roman"/>
+          <w:sz w:val="24"/>
+          <w:szCs w:val="24"/>
+        </w:rPr>
+        <w:t>XX]</w:t>
       </w:r>
       <w:r>
         <w:rPr>
@@ -278,7 +323,27 @@
           <w:sz w:val="24"/>
           <w:szCs w:val="24"/>
         </w:rPr>
-        <w:t>s vinte horas, reuniu-se em número legal, no endereço de sua sede própria, situada na Av. Ricardo Medina Filho, 577 – Vila Ipojuca – Lapa – São Paulo – SP os Irs. do quadro que assinaram o Livro de Presença sendo os Trabalhos abertos pelo Mestre da Loja Venerável</w:t>
+        <w:t xml:space="preserve">s vinte horas, reuniu-se em número legal, no endereço de sua sede própria, situada na Av. Ricardo Medina Filho, 577 – Vila Ipojuca – Lapa – São Paulo – SP os </w:t>
+      </w:r>
+      <w:proofErr w:type="spellStart"/>
+      <w:r>
+        <w:rPr>
+          <w:rFonts w:ascii="Times New Roman" w:eastAsia="Arial" w:hAnsi="Times New Roman" w:cs="Times New Roman"/>
+          <w:color w:val="000000"/>
+          <w:sz w:val="24"/>
+          <w:szCs w:val="24"/>
+        </w:rPr>
+        <w:t>Irs</w:t>
+      </w:r>
+      <w:proofErr w:type="spellEnd"/>
+      <w:r>
+        <w:rPr>
+          <w:rFonts w:ascii="Times New Roman" w:eastAsia="Arial" w:hAnsi="Times New Roman" w:cs="Times New Roman"/>
+          <w:color w:val="000000"/>
+          <w:sz w:val="24"/>
+          <w:szCs w:val="24"/>
+        </w:rPr>
+        <w:t>. do quadro que assinaram o Livro de Presença sendo os Trabalhos abertos pelo Mestre da Loja Venerável</w:t>
       </w:r>
       <w:r>
         <w:rPr>
@@ -323,7 +388,7 @@
           <w:sz w:val="24"/>
           <w:szCs w:val="24"/>
         </w:rPr>
-        <w:t>XXX</w:t>
+        <w:t>[CONFIRMAR NOME]</w:t>
       </w:r>
       <w:r>
         <w:rPr>
@@ -398,10 +463,11 @@
       <w:r>
         <w:rPr>
           <w:rFonts w:ascii="Times New Roman" w:eastAsia="Arial" w:hAnsi="Times New Roman" w:cs="Times New Roman"/>
-          <w:sz w:val="24"/>
-          <w:szCs w:val="24"/>
-        </w:rPr>
-        <w:t>XXX</w:t>
+          <w:color w:val="000000"/>
+          <w:sz w:val="24"/>
+          <w:szCs w:val="24"/>
+        </w:rPr>
+        <w:t>[CONFIRMAR NOME]</w:t>
       </w:r>
       <w:r>
         <w:rPr>
@@ -446,7 +512,7 @@
           <w:sz w:val="24"/>
           <w:szCs w:val="24"/>
         </w:rPr>
-        <w:t>XXXX</w:t>
+        <w:t>[CONFIRMAR NOME]</w:t>
       </w:r>
       <w:r>
         <w:rPr>
@@ -509,7 +575,7 @@
           <w:sz w:val="24"/>
           <w:szCs w:val="24"/>
         </w:rPr>
-        <w:t>XXX</w:t>
+        <w:t>[CONFIRMAR NOME]</w:t>
       </w:r>
       <w:r>
         <w:rPr>
@@ -536,16 +602,26 @@
           <w:sz w:val="24"/>
           <w:szCs w:val="24"/>
         </w:rPr>
-        <w:t>XXX</w:t>
-      </w:r>
-      <w:r>
-        <w:rPr>
-          <w:rFonts w:ascii="Times New Roman" w:eastAsia="Arial" w:hAnsi="Times New Roman" w:cs="Times New Roman"/>
-          <w:color w:val="000000"/>
-          <w:sz w:val="24"/>
-          <w:szCs w:val="24"/>
-        </w:rPr>
-        <w:t>, Ir. GI</w:t>
+        <w:t>[CONFIRMAR NOME]</w:t>
+      </w:r>
+      <w:r>
+        <w:rPr>
+          <w:rFonts w:ascii="Times New Roman" w:eastAsia="Arial" w:hAnsi="Times New Roman" w:cs="Times New Roman"/>
+          <w:color w:val="000000"/>
+          <w:sz w:val="24"/>
+          <w:szCs w:val="24"/>
+        </w:rPr>
+        <w:t xml:space="preserve">, Ir. </w:t>
+      </w:r>
+      <w:proofErr w:type="gramStart"/>
+      <w:r>
+        <w:rPr>
+          <w:rFonts w:ascii="Times New Roman" w:eastAsia="Arial" w:hAnsi="Times New Roman" w:cs="Times New Roman"/>
+          <w:color w:val="000000"/>
+          <w:sz w:val="24"/>
+          <w:szCs w:val="24"/>
+        </w:rPr>
+        <w:t>GI</w:t>
       </w:r>
       <w:r>
         <w:rPr>
@@ -572,7 +648,17 @@
           <w:sz w:val="24"/>
           <w:szCs w:val="24"/>
         </w:rPr>
-        <w:t>XXX</w:t>
+        <w:t>[</w:t>
+      </w:r>
+      <w:proofErr w:type="gramEnd"/>
+      <w:r>
+        <w:rPr>
+          <w:rFonts w:ascii="Times New Roman" w:eastAsia="Arial" w:hAnsi="Times New Roman" w:cs="Times New Roman"/>
+          <w:color w:val="000000"/>
+          <w:sz w:val="24"/>
+          <w:szCs w:val="24"/>
+        </w:rPr>
+        <w:t>CONFIRMAR NOME]</w:t>
       </w:r>
       <w:r>
         <w:rPr>
@@ -608,7 +694,7 @@
           <w:sz w:val="24"/>
           <w:szCs w:val="24"/>
         </w:rPr>
-        <w:t>XXXX</w:t>
+        <w:t>[CONFIRMAR NOME]</w:t>
       </w:r>
       <w:r>
         <w:rPr>
@@ -626,7 +712,27 @@
           <w:sz w:val="24"/>
           <w:szCs w:val="24"/>
         </w:rPr>
-        <w:t>e demais cargos preenchidos pelos Irs. do quadro, a pedido do Dir. de Cer.</w:t>
+        <w:t xml:space="preserve">e demais cargos preenchidos pelos </w:t>
+      </w:r>
+      <w:proofErr w:type="spellStart"/>
+      <w:r>
+        <w:rPr>
+          <w:rFonts w:ascii="Times New Roman" w:eastAsia="Arial" w:hAnsi="Times New Roman" w:cs="Times New Roman"/>
+          <w:color w:val="000000"/>
+          <w:sz w:val="24"/>
+          <w:szCs w:val="24"/>
+        </w:rPr>
+        <w:t>Irs</w:t>
+      </w:r>
+      <w:proofErr w:type="spellEnd"/>
+      <w:r>
+        <w:rPr>
+          <w:rFonts w:ascii="Times New Roman" w:eastAsia="Arial" w:hAnsi="Times New Roman" w:cs="Times New Roman"/>
+          <w:color w:val="000000"/>
+          <w:sz w:val="24"/>
+          <w:szCs w:val="24"/>
+        </w:rPr>
+        <w:t>. do quadro, a pedido do Dir. de Cer.</w:t>
       </w:r>
       <w:r>
         <w:rPr>
@@ -675,16 +781,7 @@
           <w:sz w:val="24"/>
           <w:szCs w:val="24"/>
         </w:rPr>
-        <w:t>XXXXX</w:t>
-      </w:r>
-      <w:r>
-        <w:rPr>
-          <w:rFonts w:ascii="Times New Roman" w:eastAsia="Arial" w:hAnsi="Times New Roman" w:cs="Times New Roman"/>
-          <w:color w:val="000000"/>
-          <w:sz w:val="24"/>
-          <w:szCs w:val="24"/>
-        </w:rPr>
-        <w:t>.</w:t>
+        <w:t>[CONFIRMAR NOME]</w:t>
       </w:r>
     </w:p>
     <w:p>
@@ -733,16 +830,7 @@
           <w:sz w:val="24"/>
           <w:szCs w:val="24"/>
         </w:rPr>
-        <w:t>XXX</w:t>
-      </w:r>
-      <w:r>
-        <w:rPr>
-          <w:rFonts w:ascii="Times New Roman" w:eastAsia="Arial" w:hAnsi="Times New Roman" w:cs="Times New Roman"/>
-          <w:color w:val="000000"/>
-          <w:sz w:val="24"/>
-          <w:szCs w:val="24"/>
-        </w:rPr>
-        <w:t>.</w:t>
+        <w:t>[CONFIRMAR NOME]</w:t>
       </w:r>
     </w:p>
     <w:p>
@@ -827,18 +915,32 @@
           <w:sz w:val="24"/>
           <w:szCs w:val="24"/>
         </w:rPr>
-        <w:t>XXXX</w:t>
+        <w:t>[</w:t>
+      </w:r>
+      <w:r>
+        <w:rPr>
+          <w:rFonts w:ascii="Times New Roman" w:eastAsia="Arial" w:hAnsi="Times New Roman" w:cs="Times New Roman"/>
+          <w:color w:val="000000"/>
+          <w:sz w:val="24"/>
+          <w:szCs w:val="24"/>
+        </w:rPr>
+        <w:t>ABRIR CAMPO PARA ESCREVER AS PAUTAS</w:t>
+      </w:r>
+      <w:r>
+        <w:rPr>
+          <w:rFonts w:ascii="Times New Roman" w:eastAsia="Arial" w:hAnsi="Times New Roman" w:cs="Times New Roman"/>
+          <w:color w:val="000000"/>
+          <w:sz w:val="24"/>
+          <w:szCs w:val="24"/>
+        </w:rPr>
+        <w:t>]</w:t>
       </w:r>
     </w:p>
     <w:p>
       <w:pPr>
         <w:pStyle w:val="PargrafodaLista"/>
-        <w:numPr>
-          <w:ilvl w:val="0"/>
-          <w:numId w:val="9"/>
-        </w:numPr>
         <w:spacing w:before="240"/>
-        <w:ind w:right="-45"/>
+        <w:ind w:left="436" w:right="-45"/>
         <w:jc w:val="both"/>
         <w:rPr>
           <w:rFonts w:ascii="Times New Roman" w:eastAsia="Arial" w:hAnsi="Times New Roman" w:cs="Times New Roman"/>
@@ -847,15 +949,6 @@
           <w:szCs w:val="24"/>
         </w:rPr>
       </w:pPr>
-      <w:r>
-        <w:rPr>
-          <w:rFonts w:ascii="Times New Roman" w:eastAsia="Arial" w:hAnsi="Times New Roman" w:cs="Times New Roman"/>
-          <w:color w:val="000000"/>
-          <w:sz w:val="24"/>
-          <w:szCs w:val="24"/>
-        </w:rPr>
-        <w:t>XXX</w:t>
-      </w:r>
     </w:p>
     <w:p>
       <w:pPr>
@@ -910,8 +1003,19 @@
           <w:sz w:val="24"/>
           <w:szCs w:val="24"/>
         </w:rPr>
-        <w:t>o Secr</w:t>
-      </w:r>
+        <w:t xml:space="preserve">o </w:t>
+      </w:r>
+      <w:proofErr w:type="spellStart"/>
+      <w:r>
+        <w:rPr>
+          <w:rFonts w:ascii="Times New Roman" w:eastAsia="Arial" w:hAnsi="Times New Roman" w:cs="Times New Roman"/>
+          <w:color w:val="000000"/>
+          <w:sz w:val="24"/>
+          <w:szCs w:val="24"/>
+        </w:rPr>
+        <w:t>Secr</w:t>
+      </w:r>
+      <w:proofErr w:type="spellEnd"/>
       <w:r>
         <w:rPr>
           <w:rFonts w:ascii="Times New Roman" w:eastAsia="Arial" w:hAnsi="Times New Roman" w:cs="Times New Roman"/>
@@ -928,16 +1032,7 @@
           <w:sz w:val="24"/>
           <w:szCs w:val="24"/>
         </w:rPr>
-        <w:t>XXX</w:t>
-      </w:r>
-      <w:r>
-        <w:rPr>
-          <w:rFonts w:ascii="Times New Roman" w:eastAsia="Arial" w:hAnsi="Times New Roman" w:cs="Times New Roman"/>
-          <w:color w:val="000000"/>
-          <w:sz w:val="24"/>
-          <w:szCs w:val="24"/>
-        </w:rPr>
-        <w:t>.</w:t>
+        <w:t>[ABRIR CAMPO PARA ESCREVER]</w:t>
       </w:r>
     </w:p>
     <w:p>
@@ -991,7 +1086,7 @@
           <w:sz w:val="24"/>
           <w:szCs w:val="24"/>
         </w:rPr>
-        <w:t>XXX</w:t>
+        <w:t>[ABRIR CAMPO PARA ESCREVER]</w:t>
       </w:r>
       <w:r>
         <w:rPr>
@@ -1005,7 +1100,19 @@
     </w:p>
     <w:p>
       <w:pPr>
-        <w:ind w:left="720"/>
+        <w:pStyle w:val="PargrafodaLista"/>
+        <w:rPr>
+          <w:rFonts w:ascii="Times New Roman" w:eastAsia="Arial" w:hAnsi="Times New Roman" w:cs="Times New Roman"/>
+          <w:color w:val="000000"/>
+          <w:sz w:val="24"/>
+          <w:szCs w:val="24"/>
+        </w:rPr>
+      </w:pPr>
+    </w:p>
+    <w:p>
+      <w:pPr>
+        <w:pStyle w:val="PargrafodaLista"/>
+        <w:ind w:left="1080"/>
         <w:rPr>
           <w:rFonts w:ascii="Times New Roman" w:eastAsia="Arial" w:hAnsi="Times New Roman" w:cs="Times New Roman"/>
           <w:color w:val="000000"/>
@@ -1122,7 +1229,7 @@
           <w:sz w:val="24"/>
           <w:szCs w:val="24"/>
         </w:rPr>
-        <w:t>XXX</w:t>
+        <w:t>[ABRIR CAMPO PARA ESCREVER]</w:t>
       </w:r>
     </w:p>
     <w:p>
@@ -1170,16 +1277,36 @@
           <w:sz w:val="24"/>
           <w:szCs w:val="24"/>
         </w:rPr>
-        <w:t>XXX</w:t>
-      </w:r>
-      <w:r>
-        <w:rPr>
-          <w:rFonts w:ascii="Times New Roman" w:eastAsia="Arial" w:hAnsi="Times New Roman" w:cs="Times New Roman"/>
-          <w:color w:val="000000"/>
-          <w:sz w:val="24"/>
-          <w:szCs w:val="24"/>
-        </w:rPr>
-        <w:t>obreiros,</w:t>
+        <w:t xml:space="preserve">[ABRIR CAMPO PARA </w:t>
+      </w:r>
+      <w:proofErr w:type="gramStart"/>
+      <w:r>
+        <w:rPr>
+          <w:rFonts w:ascii="Times New Roman" w:eastAsia="Arial" w:hAnsi="Times New Roman" w:cs="Times New Roman"/>
+          <w:color w:val="000000"/>
+          <w:sz w:val="24"/>
+          <w:szCs w:val="24"/>
+        </w:rPr>
+        <w:t>ESCREVER]</w:t>
+      </w:r>
+      <w:r>
+        <w:rPr>
+          <w:rFonts w:ascii="Times New Roman" w:eastAsia="Arial" w:hAnsi="Times New Roman" w:cs="Times New Roman"/>
+          <w:color w:val="000000"/>
+          <w:sz w:val="24"/>
+          <w:szCs w:val="24"/>
+        </w:rPr>
+        <w:t>obreiros</w:t>
+      </w:r>
+      <w:proofErr w:type="gramEnd"/>
+      <w:r>
+        <w:rPr>
+          <w:rFonts w:ascii="Times New Roman" w:eastAsia="Arial" w:hAnsi="Times New Roman" w:cs="Times New Roman"/>
+          <w:color w:val="000000"/>
+          <w:sz w:val="24"/>
+          <w:szCs w:val="24"/>
+        </w:rPr>
+        <w:t>,</w:t>
       </w:r>
       <w:r>
         <w:t xml:space="preserve"> </w:t>
@@ -1200,7 +1327,7 @@
           <w:sz w:val="24"/>
           <w:szCs w:val="24"/>
         </w:rPr>
-        <w:t>XX</w:t>
+        <w:t>[ABRIR CAMPO PARA ESCREVER]</w:t>
       </w:r>
       <w:r>
         <w:rPr>
@@ -1218,7 +1345,7 @@
           <w:sz w:val="24"/>
           <w:szCs w:val="24"/>
         </w:rPr>
-        <w:t>XXX</w:t>
+        <w:t>[ABRIR CAMPO PARA ESCREVER]</w:t>
       </w:r>
       <w:r>
         <w:rPr>
@@ -1293,7 +1420,27 @@
           <w:sz w:val="24"/>
           <w:szCs w:val="24"/>
         </w:rPr>
-        <w:t xml:space="preserve">Nada mais havendo a tratar e, estando justa e perfeita a Sessão, o M. da Loja encerrou os TTrab. as </w:t>
+        <w:t xml:space="preserve">Nada mais havendo a tratar e, estando justa e perfeita a Sessão, o M. da Loja encerrou os </w:t>
+      </w:r>
+      <w:proofErr w:type="spellStart"/>
+      <w:r>
+        <w:rPr>
+          <w:rFonts w:ascii="Times New Roman" w:eastAsia="Arial" w:hAnsi="Times New Roman" w:cs="Times New Roman"/>
+          <w:color w:val="000000"/>
+          <w:sz w:val="24"/>
+          <w:szCs w:val="24"/>
+        </w:rPr>
+        <w:t>TTrab</w:t>
+      </w:r>
+      <w:proofErr w:type="spellEnd"/>
+      <w:r>
+        <w:rPr>
+          <w:rFonts w:ascii="Times New Roman" w:eastAsia="Arial" w:hAnsi="Times New Roman" w:cs="Times New Roman"/>
+          <w:color w:val="000000"/>
+          <w:sz w:val="24"/>
+          <w:szCs w:val="24"/>
+        </w:rPr>
+        <w:t xml:space="preserve">. as </w:t>
       </w:r>
       <w:r>
         <w:rPr>

</xml_diff>